<commit_message>
Update client resume and add candidate submission note with tech experience mapping
</commit_message>
<xml_diff>
--- a/resume/Nishant_Saxena_Resume_sent_to_Client.docx
+++ b/resume/Nishant_Saxena_Resume_sent_to_Client.docx
@@ -170,29 +170,19 @@
         <w:ind w:left="720" w:hanging="360"/>
       </w:pPr>
       <w:r>
-        <w:rPr>
-          <w:rFonts w:ascii="Times New Roman" w:hAnsi="Times New Roman"/>
-          <w:sz w:val="18"/>
-          <w:szCs w:val="18"/>
-        </w:rPr>
-        <w:t>•  Owned end-to-end integrations with external systems — ERP SOAP/WSDL endpoints, WebMethods XML services, Salesforce webhooks, SharePoint, and legacy file-based feeds — normalizing inconsistent external schemas into canonical, validated models.</w:t>
-      </w:r>
-    </w:p>
-    <w:p>
-      <w:pPr>
-        <w:widowControl w:val="0"/>
-        <w:autoSpaceDE w:val="0"/>
-        <w:autoSpaceDN w:val="0"/>
-        <w:spacing w:after="40" w:line="260" w:lineRule="auto"/>
-        <w:ind w:left="720" w:hanging="360"/>
-      </w:pPr>
-      <w:r>
-        <w:rPr>
-          <w:rFonts w:ascii="Times New Roman" w:hAnsi="Times New Roman"/>
-          <w:sz w:val="18"/>
-          <w:szCs w:val="18"/>
-        </w:rPr>
-        <w:t>•  Engineered resilience under upstream SLAs: idempotency keys, DynamoDB-backed deduplication, retry with exponential backoff, structured exception handling, and fallback paths.</w:t>
+        <w:t>•  Owned end-to-end multi-tenant integrations with 40+ external partner systems — ERP SOAP/WSDL endpoints, WebMethods XML services, DMS/CRM platforms, webhooks, and file-based feeds — landing raw data into S3 medallion layers (Landing -&gt; Bronze -&gt; Silver -&gt; Gold) and normalizing inconsistent external schemas into canonical, Pydantic/JSON Schema validated models.</w:t>
+      </w:r>
+    </w:p>
+    <w:p>
+      <w:pPr>
+        <w:widowControl w:val="0"/>
+        <w:autoSpaceDE w:val="0"/>
+        <w:autoSpaceDN w:val="0"/>
+        <w:spacing w:after="40" w:line="260" w:lineRule="auto"/>
+        <w:ind w:left="720" w:hanging="360"/>
+      </w:pPr>
+      <w:r>
+        <w:t>•  Engineered resilience under upstream SLAs using Python (AWS Lambda Powertools): idempotency keys, DynamoDB-backed deduplication, rate limiting, exponential backoff, structured exception handling, OpenTelemetry tracing to CloudWatch, and fallback paths.</w:t>
       </w:r>
     </w:p>
     <w:p>
@@ -626,12 +616,7 @@
         <w:ind w:left="720" w:hanging="360"/>
       </w:pPr>
       <w:r>
-        <w:rPr>
-          <w:rFonts w:ascii="Times New Roman" w:hAnsi="Times New Roman"/>
-          <w:sz w:val="18"/>
-          <w:szCs w:val="18"/>
-        </w:rPr>
-        <w:t>•  Architected a high-scale Django Reconciliation Engine to securely validate high-volume (100,000+) migrated records under strict infrastructure constraints.</w:t>
+        <w:t>•  Architected a high-scale Python/Django Reconciliation Engine (cent_poc) to securely validate high-volume (100,000+) migrated records across Salesforce and Novasys without internal model bloat, using a memory-safe flat-file chunking pipeline and single-query DB batch hits.</w:t>
       </w:r>
     </w:p>
     <w:p>

</xml_diff>